<commit_message>
ENGINE_VERSION: 3. Implemented Template rebuild services. Added ENGINE_VERSION stamp to TemplateConfig blueprint. Auto replacement for system templates on seeding. Fixed Page breaks bug. Soft line breaks don't split placeholders anymore. Fixed missing tabs bug.
</commit_message>
<xml_diff>
--- a/tests/fixtures/real_templates/languages_invalid.docx
+++ b/tests/fixtures/real_templates/languages_invalid.docx
@@ -590,91 +590,28 @@
           <w:rtl w:val="0"/>
         </w:rPr>
         <w:t xml:space="preserve"> {{</w:t>
-      </w:r>
-    </w:p>
-    <w:p>
-      <w:pPr>
-        <w:rPr/>
-      </w:pPr>
-      <w:r>
-        <w:rPr>
-          <w:rtl w:val="0"/>
-        </w:rPr>
+        <w:br w:type="textWrapping"/>
         <w:tab/>
         <w:t xml:space="preserve">(</w:t>
-      </w:r>
-    </w:p>
-    <w:p>
-      <w:pPr>
-        <w:rPr/>
-      </w:pPr>
-      <w:r>
-        <w:rPr>
-          <w:rtl w:val="0"/>
-        </w:rPr>
+        <w:br w:type="textWrapping"/>
         <w:tab/>
         <w:tab/>
         <w:t xml:space="preserve">(“ENG: “, client_name.ENG, client_country.ENG),</w:t>
-      </w:r>
-    </w:p>
-    <w:p>
-      <w:pPr>
-        <w:rPr/>
-      </w:pPr>
-      <w:r>
-        <w:rPr>
-          <w:rtl w:val="0"/>
-        </w:rPr>
+        <w:br w:type="textWrapping"/>
         <w:tab/>
         <w:tab/>
         <w:t xml:space="preserve">(“ENG + UKR: “, client_name.ENG, client_name.UKR),</w:t>
-      </w:r>
-    </w:p>
-    <w:p>
-      <w:pPr>
-        <w:rPr/>
-      </w:pPr>
-      <w:r>
-        <w:rPr>
-          <w:rtl w:val="0"/>
-        </w:rPr>
+        <w:br w:type="textWrapping"/>
         <w:tab/>
         <w:tab/>
         <w:t xml:space="preserve">(“UKR: “, client_name.UKR, client_country.UKR),</w:t>
-      </w:r>
-    </w:p>
-    <w:p>
-      <w:pPr>
-        <w:ind w:firstLine="720"/>
-        <w:rPr/>
-      </w:pPr>
-      <w:r>
-        <w:rPr>
-          <w:rtl w:val="0"/>
-        </w:rPr>
+        <w:br w:type="textWrapping"/>
+        <w:tab/>
         <w:t xml:space="preserve">),</w:t>
-      </w:r>
-    </w:p>
-    <w:p>
-      <w:pPr>
-        <w:ind w:firstLine="720"/>
-        <w:rPr/>
-      </w:pPr>
-      <w:r>
-        <w:rPr>
-          <w:rtl w:val="0"/>
-        </w:rPr>
+        <w:br w:type="textWrapping"/>
+        <w:tab/>
         <w:t xml:space="preserve">sep=”\n”</w:t>
-      </w:r>
-    </w:p>
-    <w:p>
-      <w:pPr>
-        <w:rPr/>
-      </w:pPr>
-      <w:r>
-        <w:rPr>
-          <w:rtl w:val="0"/>
-        </w:rPr>
+        <w:br w:type="textWrapping"/>
         <w:t xml:space="preserve">}}</w:t>
       </w:r>
     </w:p>
@@ -694,6 +631,16 @@
       </w:pPr>
       <w:r>
         <w:rPr>
+          <w:rtl w:val="0"/>
+        </w:rPr>
+      </w:r>
+    </w:p>
+    <w:p>
+      <w:pPr>
+        <w:rPr/>
+      </w:pPr>
+      <w:r>
+        <w:rPr>
           <w:b w:val="1"/>
           <w:bCs w:val="1"/>
           <w:rtl w:val="0"/>
@@ -705,89 +652,28 @@
           <w:rtl w:val="0"/>
         </w:rPr>
         <w:t xml:space="preserve">: {{</w:t>
-      </w:r>
-    </w:p>
-    <w:p>
-      <w:pPr>
-        <w:ind w:firstLine="720"/>
-        <w:rPr/>
-      </w:pPr>
-      <w:r>
-        <w:rPr>
-          <w:rtl w:val="0"/>
-        </w:rPr>
+        <w:br w:type="textWrapping"/>
+        <w:tab/>
         <w:t xml:space="preserve">(</w:t>
-      </w:r>
-    </w:p>
-    <w:p>
-      <w:pPr>
-        <w:ind w:left="720" w:firstLine="720"/>
-        <w:rPr/>
-      </w:pPr>
-      <w:r>
-        <w:rPr>
-          <w:rtl w:val="0"/>
-        </w:rPr>
+        <w:br w:type="textWrapping"/>
+        <w:tab/>
+        <w:tab/>
         <w:t xml:space="preserve">(“ENG: “, client_name.ENG, client_country.ENG),</w:t>
-      </w:r>
-    </w:p>
-    <w:p>
-      <w:pPr>
-        <w:ind w:left="720" w:firstLine="720"/>
-        <w:rPr/>
-      </w:pPr>
-      <w:r>
-        <w:rPr>
-          <w:rtl w:val="0"/>
-        </w:rPr>
+        <w:br w:type="textWrapping"/>
+        <w:tab/>
+        <w:tab/>
         <w:t xml:space="preserve">(“ENG + THIRD: “, client_country.ENG, client_country.SPA),</w:t>
-      </w:r>
-    </w:p>
-    <w:p>
-      <w:pPr>
-        <w:ind w:left="720" w:firstLine="720"/>
-        <w:rPr/>
-      </w:pPr>
-      <w:r>
-        <w:rPr>
-          <w:rtl w:val="0"/>
-        </w:rPr>
+        <w:br w:type="textWrapping"/>
+        <w:tab/>
+        <w:tab/>
         <w:t xml:space="preserve">(“ENG + INVALID: “, client_name.ENG, client_name.FOO),</w:t>
-      </w:r>
-    </w:p>
-    <w:p>
-      <w:pPr>
-        <w:ind w:left="720" w:firstLine="0"/>
-        <w:rPr/>
-      </w:pPr>
-      <w:r>
-        <w:rPr>
-          <w:rtl w:val="0"/>
-        </w:rPr>
+        <w:br w:type="textWrapping"/>
+        <w:tab/>
         <w:t xml:space="preserve">),</w:t>
-      </w:r>
-    </w:p>
-    <w:p>
-      <w:pPr>
-        <w:ind w:left="720" w:firstLine="0"/>
-        <w:rPr/>
-      </w:pPr>
-      <w:r>
-        <w:rPr>
-          <w:rtl w:val="0"/>
-        </w:rPr>
+        <w:br w:type="textWrapping"/>
+        <w:tab/>
         <w:t xml:space="preserve">sep=”\n”</w:t>
-      </w:r>
-    </w:p>
-    <w:p>
-      <w:pPr>
-        <w:ind w:left="0" w:firstLine="0"/>
-        <w:rPr/>
-      </w:pPr>
-      <w:r>
-        <w:rPr>
-          <w:rtl w:val="0"/>
-        </w:rPr>
+        <w:br w:type="textWrapping"/>
         <w:t xml:space="preserve">}}</w:t>
       </w:r>
       <w:r>

</xml_diff>